<commit_message>
Update lecture study notes (01-04): clean student take-notes format
</commit_message>
<xml_diff>
--- a/notes/01-introduction-to-machine-learning.docx
+++ b/notes/01-introduction-to-machine-learning.docx
@@ -4,15 +4,23 @@
   <w:body>
     <w:p>
       <w:pPr>
-        <w:pStyle w:val="Title"/>
+        <w:pStyle w:val="Heading1"/>
       </w:pPr>
       <w:r>
-        <w:t>Bài 1: Tổng quan về máy học</w:t>
+        <w:t>Bài 1 — Tổng quan về máy học</w:t>
       </w:r>
     </w:p>
     <w:p>
+      <w:pPr>
+        <w:jc w:val="left"/>
+      </w:pPr>
       <w:r>
-        <w:t>Ghi chú của sinh viên, tổng hợp từ slide bài giảng NCKH.</w:t>
+        <w:rPr>
+          <w:i/>
+          <w:color w:val="666666"/>
+          <w:sz w:val="18"/>
+        </w:rPr>
+        <w:t>Ghi chú sinh viên tổng hợp từ bộ slide NCKH  •  Introduction to Machine Learning</w:t>
       </w:r>
     </w:p>
     <w:p>
@@ -20,12 +28,141 @@
         <w:pStyle w:val="Heading2"/>
       </w:pPr>
       <w:r>
-        <w:t>TỔNG QUAN VỀ MÁY HỌC</w:t>
+        <w:t>1. Máy học là gì?</w:t>
       </w:r>
     </w:p>
     <w:p>
+      <w:pPr/>
       <w:r>
-        <w:t>INTRODUCTION MACHINE LEARNING</w:t>
+        <w:rPr>
+          <w:b w:val="0"/>
+          <w:i w:val="0"/>
+        </w:rPr>
+        <w:t>Máy học là một nhánh của trí tuệ nhân tạo, chuyên thiết kế và phát triển các thuật toán cho phép máy tính tự suy luận và cải thiện hành vi dựa trên dữ liệu thực nghiệm, thay vì được lập trình cứng từng quy tắc.</w:t>
+      </w:r>
+    </w:p>
+    <w:p>
+      <w:pPr/>
+      <w:r>
+        <w:rPr>
+          <w:b w:val="0"/>
+          <w:i w:val="0"/>
+        </w:rPr>
+        <w:t>Điểm khác biệt cốt lõi so với lập trình truyền thống:</w:t>
+      </w:r>
+    </w:p>
+    <w:p>
+      <w:pPr>
+        <w:pStyle w:val="ListBullet"/>
+      </w:pPr>
+      <w:r>
+        <w:rPr>
+          <w:b w:val="0"/>
+          <w:i w:val="0"/>
+        </w:rPr>
+        <w:t>Lập trình truyền thống: độ phức tạp nằm ở mã nguồn do con người viết; dữ liệu chỉ là đầu vào phụ.</w:t>
+      </w:r>
+    </w:p>
+    <w:p>
+      <w:pPr>
+        <w:pStyle w:val="ListBullet"/>
+      </w:pPr>
+      <w:r>
+        <w:rPr>
+          <w:b w:val="0"/>
+          <w:i w:val="0"/>
+        </w:rPr>
+        <w:t>Máy học: thuật toán về nguyên tắc khá đơn giản, còn độ phức tạp nằm ở chính cấu trúc của dữ liệu. Nhiệm vụ của chúng ta là để máy tự học ra cấu trúc đó.</w:t>
+      </w:r>
+    </w:p>
+    <w:p>
+      <w:pPr>
+        <w:pStyle w:val="ListBullet"/>
+      </w:pPr>
+      <w:r>
+        <w:rPr>
+          <w:b w:val="0"/>
+          <w:i w:val="0"/>
+        </w:rPr>
+        <w:t>Sơ đồ trực quan trong slide minh họa rất rõ: Dữ liệu huấn luyện + thuật toán học → máy đã được huấn luyện; sau đó đưa câu hỏi mới vào máy sẽ trả lời.</w:t>
+      </w:r>
+    </w:p>
+    <w:p>
+      <w:pPr>
+        <w:pStyle w:val="Heading3"/>
+      </w:pPr>
+      <w:r>
+        <w:t>Các định nghĩa kinh điển cần nhớ</w:t>
+      </w:r>
+    </w:p>
+    <w:p>
+      <w:pPr>
+        <w:pStyle w:val="ListBullet"/>
+      </w:pPr>
+      <w:r>
+        <w:rPr>
+          <w:b w:val="0"/>
+          <w:i w:val="0"/>
+        </w:rPr>
+        <w:t>Arthur Samuel (1959): "Máy học là lĩnh vực cho máy tính khả năng học mà không cần được lập trình tường minh."</w:t>
+      </w:r>
+    </w:p>
+    <w:p>
+      <w:pPr>
+        <w:pStyle w:val="ListBullet"/>
+      </w:pPr>
+      <w:r>
+        <w:rPr>
+          <w:b w:val="0"/>
+          <w:i w:val="0"/>
+        </w:rPr>
+        <w:t>Ethem Alpaydin: máy học là việc lập trình cho máy tính tối ưu một tiêu chí hiệu năng dựa trên dữ liệu ví dụ hoặc kinh nghiệm trong quá khứ.</w:t>
+      </w:r>
+    </w:p>
+    <w:p>
+      <w:pPr>
+        <w:pStyle w:val="ListBullet"/>
+      </w:pPr>
+      <w:r>
+        <w:rPr>
+          <w:b w:val="0"/>
+          <w:i w:val="0"/>
+        </w:rPr>
+        <w:t>Kevin P. Murphy: mục tiêu của máy học là phát hiện quy luật trong dữ liệu, rồi dùng quy luật đó để dự báo dữ liệu tương lai.</w:t>
+      </w:r>
+    </w:p>
+    <w:p>
+      <w:pPr>
+        <w:pStyle w:val="ListBullet"/>
+      </w:pPr>
+      <w:r>
+        <w:rPr>
+          <w:b w:val="0"/>
+          <w:i w:val="0"/>
+        </w:rPr>
+        <w:t>Herbert Simon: học là bất kỳ quá trình nào giúp hệ thống cải thiện hiệu năng thông qua kinh nghiệm.</w:t>
+      </w:r>
+    </w:p>
+    <w:p>
+      <w:pPr>
+        <w:pStyle w:val="ListBullet"/>
+      </w:pPr>
+      <w:r>
+        <w:rPr>
+          <w:b w:val="0"/>
+          <w:i w:val="0"/>
+        </w:rPr>
+        <w:t>Carnegie Mellon đặt câu hỏi trung tâm: làm sao xây dựng hệ thống tự cải thiện theo kinh nghiệm và đâu là định luật chi phối mọi quá trình học?</w:t>
+      </w:r>
+    </w:p>
+    <w:p>
+      <w:pPr/>
+      <w:r>
+        <w:rPr>
+          <w:b w:val="0"/>
+          <w:i w:val="0"/>
+        </w:rPr>
+        <w:t>Ví dụ quen thuộc trong slide là bộ lọc thư rác: máy học cách phân loại thư điện tử là spam hay không và tự động xếp vào thư mục tương ứng.</w:t>
       </w:r>
     </w:p>
     <w:p>
@@ -33,12 +170,61 @@
         <w:pStyle w:val="Heading2"/>
       </w:pPr>
       <w:r>
-        <w:t>MÁY HỌC LÀ GÌ</w:t>
+        <w:t>2. Định nghĩa hình thức của Mitchell</w:t>
       </w:r>
     </w:p>
     <w:p>
+      <w:pPr/>
       <w:r>
-        <w:t>What is machine learning?</w:t>
+        <w:rPr>
+          <w:b w:val="0"/>
+          <w:i w:val="0"/>
+        </w:rPr>
+        <w:t>Một chương trình được gọi là học từ kinh nghiệm E để hoàn thành nhiệm vụ T, với hiệu năng được đo bằng phép đánh giá P, nếu hiệu năng khi làm nhiệm vụ T, đo bằng P, được cải thiện theo kinh nghiệm E.</w:t>
+      </w:r>
+    </w:p>
+    <w:p>
+      <w:pPr>
+        <w:pStyle w:val="Heading3"/>
+      </w:pPr>
+      <w:r>
+        <w:t>Ba thành phần T – P – E</w:t>
+      </w:r>
+    </w:p>
+    <w:p>
+      <w:pPr>
+        <w:pStyle w:val="ListBullet"/>
+      </w:pPr>
+      <w:r>
+        <w:rPr>
+          <w:b w:val="0"/>
+          <w:i w:val="0"/>
+        </w:rPr>
+        <w:t>Nhiệm vụ T (Task): có ba nhóm nhiệm vụ lớn mà máy học thường giải quyết là phân loại (classification), hồi quy (regression / tiên lượng giá trị liên tục) và phân cụm (clustering / kết nhóm).</w:t>
+      </w:r>
+    </w:p>
+    <w:p>
+      <w:pPr>
+        <w:pStyle w:val="ListBullet"/>
+      </w:pPr>
+      <w:r>
+        <w:rPr>
+          <w:b w:val="0"/>
+          <w:i w:val="0"/>
+        </w:rPr>
+        <w:t>Phép đánh giá P (Performance): để đo hiệu quả, ta chia dữ liệu thành ba tập — tập huấn luyện dùng để tìm tham số mô hình, tập đánh giá (validation) dùng để tinh chỉnh, và tập kiểm thử (test) dùng để đo hiệu năng cuối cùng. Đơn vị cơ bản là điểm dữ liệu (data point), tập hợp lại thành tập dữ liệu (dataset).</w:t>
+      </w:r>
+    </w:p>
+    <w:p>
+      <w:pPr>
+        <w:pStyle w:val="ListBullet"/>
+      </w:pPr>
+      <w:r>
+        <w:rPr>
+          <w:b w:val="0"/>
+          <w:i w:val="0"/>
+        </w:rPr>
+        <w:t>Kinh nghiệm E (Experience): chính là việc cho mô hình trải nghiệm trên các tập dữ liệu khác nhau. Dữ liệu khác nhau sẽ cho mô hình khác nhau, và chất lượng dữ liệu quyết định trực tiếp chất lượng mô hình. Dựa vào đặc trưng của dữ liệu, người ta chia máy học thành hai họ lớn là học có giám sát và học không giám sát.</w:t>
       </w:r>
     </w:p>
     <w:p>
@@ -46,37 +232,25 @@
         <w:pStyle w:val="Heading2"/>
       </w:pPr>
       <w:r>
-        <w:t>What is machine learning?</w:t>
+        <w:t>3. Hai họ thuật toán chính</w:t>
       </w:r>
     </w:p>
     <w:p>
+      <w:pPr>
+        <w:pStyle w:val="Heading3"/>
+      </w:pPr>
       <w:r>
-        <w:t>Learning algorithm</w:t>
+        <w:t>Học có giám sát (Supervised learning)</w:t>
       </w:r>
     </w:p>
     <w:p>
+      <w:pPr/>
       <w:r>
-        <w:t>TRAINING</w:t>
-      </w:r>
-    </w:p>
-    <w:p>
-      <w:r>
-        <w:t>DATA</w:t>
-      </w:r>
-    </w:p>
-    <w:p>
-      <w:r>
-        <w:t>Answer</w:t>
-      </w:r>
-    </w:p>
-    <w:p>
-      <w:r>
-        <w:t>Trained machine</w:t>
-      </w:r>
-    </w:p>
-    <w:p>
-      <w:r>
-        <w:t>Query</w:t>
+        <w:rPr>
+          <w:b w:val="0"/>
+          <w:i w:val="0"/>
+        </w:rPr>
+        <w:t>Ý tưởng: thuật toán dự đoán đầu ra cho dữ liệu mới dựa trên các cặp (đầu vào, đầu ra) đã biết trước.</w:t>
       </w:r>
     </w:p>
     <w:p>
@@ -84,7 +258,29 @@
         <w:pStyle w:val="ListBullet"/>
       </w:pPr>
       <w:r>
-        <w:t>A branch of artificial intelligence, concerned with the design and development of algorithms that allow computers to evolve behaviors based on empirical data.</w:t>
+        <w:rPr>
+          <w:b w:val="0"/>
+          <w:i w:val="0"/>
+        </w:rPr>
+        <w:t>Phát biểu bài toán: cho tập đầu vào X = {x1, x2, …, xN} và tập đầu ra Y = {y1, y2, …, yM}, mỗi cặp (xi, yi) tạo thành một mẫu huấn luyện. Nhiệm vụ là tìm hàm f sao cho yi ≈ f(xi), và hàm này đủ tốt để với một x mới, ta tính được nhãn dự đoán y_hat = f(x).</w:t>
+      </w:r>
+    </w:p>
+    <w:p>
+      <w:pPr>
+        <w:pStyle w:val="Heading3"/>
+      </w:pPr>
+      <w:r>
+        <w:t>Học không giám sát (Unsupervised learning)</w:t>
+      </w:r>
+    </w:p>
+    <w:p>
+      <w:pPr/>
+      <w:r>
+        <w:rPr>
+          <w:b w:val="0"/>
+          <w:i w:val="0"/>
+        </w:rPr>
+        <w:t>Ý tưởng: thuật toán chỉ dựa vào cấu trúc của dữ liệu đầu vào để thực hiện một công việc nào đó, không có nhãn đầu ra cho trước.</w:t>
       </w:r>
     </w:p>
     <w:p>
@@ -92,7 +288,11 @@
         <w:pStyle w:val="ListBullet"/>
       </w:pPr>
       <w:r>
-        <w:t>Máy học là một nhánh trí tuệ nhân tạo (artificial intelligence), liên quan đến việc thiết kế (design) và phát triển (development) các thuật toán cho phép máy tính suy luận (to evolve) dựa trên dữ liệu thực nghiệm (empirical data).</w:t>
+        <w:rPr>
+          <w:b w:val="0"/>
+          <w:i w:val="0"/>
+        </w:rPr>
+        <w:t>Hai công việc điển hình là phân nhóm (clustering) và giảm số chiều dữ liệu (dimensionality reduction). Mục tiêu là mô hình hóa cấu trúc nền tảng của dữ liệu để hiểu sâu hơn về chính dữ liệu đó.</w:t>
       </w:r>
     </w:p>
     <w:p>
@@ -100,7 +300,533 @@
         <w:pStyle w:val="ListBullet"/>
       </w:pPr>
       <w:r>
-        <w:t>Ví dụnhư các máy có thể"học" cách phân loại thư điện tửxem có phải thư rác (spam) hay không và tựđộng xếp thư vào thư mục tương ứng.</w:t>
+        <w:rPr>
+          <w:b w:val="0"/>
+          <w:i w:val="0"/>
+        </w:rPr>
+        <w:t>Phát biểu bài toán: chỉ có tập đầu vào X = {x1, …, xN}, không có Y. Từ X, ta phát hiện mối quan hệ giữa các biến hoặc giữa các quan sát.</w:t>
+      </w:r>
+    </w:p>
+    <w:p>
+      <w:pPr>
+        <w:pStyle w:val="Heading2"/>
+      </w:pPr>
+      <w:r>
+        <w:t>4. Mục tiêu tối ưu của từng họ</w:t>
+      </w:r>
+    </w:p>
+    <w:tbl>
+      <w:tblPr>
+        <w:tblStyle w:val="LightGrid-Accent1"/>
+        <w:tblW w:type="auto" w:w="0"/>
+        <w:jc w:val="center"/>
+        <w:tblLook w:firstColumn="1" w:firstRow="1" w:lastColumn="0" w:lastRow="0" w:noHBand="0" w:noVBand="1" w:val="04A0"/>
+      </w:tblPr>
+      <w:tblGrid>
+        <w:gridCol w:w="3408"/>
+        <w:gridCol w:w="3408"/>
+        <w:gridCol w:w="3408"/>
+      </w:tblGrid>
+      <w:tr>
+        <w:tc>
+          <w:tcPr>
+            <w:tcW w:type="dxa" w:w="3408"/>
+          </w:tcPr>
+          <w:p>
+            <w:pPr>
+              <w:jc w:val="center"/>
+            </w:pPr>
+            <w:r>
+              <w:rPr>
+                <w:b/>
+                <w:sz w:val="17"/>
+              </w:rPr>
+              <w:t>Họ thuật toán</w:t>
+            </w:r>
+          </w:p>
+        </w:tc>
+        <w:tc>
+          <w:tcPr>
+            <w:tcW w:type="dxa" w:w="3408"/>
+          </w:tcPr>
+          <w:p>
+            <w:pPr>
+              <w:jc w:val="center"/>
+            </w:pPr>
+            <w:r>
+              <w:rPr>
+                <w:b/>
+                <w:sz w:val="17"/>
+              </w:rPr>
+              <w:t>Mục tiêu tối ưu</w:t>
+            </w:r>
+          </w:p>
+        </w:tc>
+        <w:tc>
+          <w:tcPr>
+            <w:tcW w:type="dxa" w:w="3408"/>
+          </w:tcPr>
+          <w:p>
+            <w:pPr>
+              <w:jc w:val="center"/>
+            </w:pPr>
+            <w:r>
+              <w:rPr>
+                <w:b/>
+                <w:sz w:val="17"/>
+              </w:rPr>
+              <w:t>Ghi chú</w:t>
+            </w:r>
+          </w:p>
+        </w:tc>
+      </w:tr>
+      <w:tr>
+        <w:tc>
+          <w:tcPr>
+            <w:tcW w:type="dxa" w:w="3408"/>
+          </w:tcPr>
+          <w:p>
+            <w:pPr>
+              <w:jc w:val="center"/>
+            </w:pPr>
+            <w:r>
+              <w:rPr>
+                <w:sz w:val="17"/>
+              </w:rPr>
+              <w:t>Học có giám sát</w:t>
+            </w:r>
+          </w:p>
+        </w:tc>
+        <w:tc>
+          <w:tcPr>
+            <w:tcW w:type="dxa" w:w="3408"/>
+          </w:tcPr>
+          <w:p>
+            <w:pPr>
+              <w:jc w:val="center"/>
+            </w:pPr>
+            <w:r>
+              <w:rPr>
+                <w:sz w:val="17"/>
+              </w:rPr>
+              <w:t>Lỗi thấp (low error), tối đa hóa xác suất (maximize likelihood)</w:t>
+            </w:r>
+          </w:p>
+        </w:tc>
+        <w:tc>
+          <w:tcPr>
+            <w:tcW w:type="dxa" w:w="3408"/>
+          </w:tcPr>
+          <w:p>
+            <w:pPr>
+              <w:jc w:val="center"/>
+            </w:pPr>
+            <w:r>
+              <w:rPr>
+                <w:sz w:val="17"/>
+              </w:rPr>
+              <w:t>Cố gắng dự đoán đúng nhãn</w:t>
+            </w:r>
+          </w:p>
+        </w:tc>
+      </w:tr>
+      <w:tr>
+        <w:tc>
+          <w:tcPr>
+            <w:tcW w:type="dxa" w:w="3408"/>
+          </w:tcPr>
+          <w:p>
+            <w:pPr>
+              <w:jc w:val="center"/>
+            </w:pPr>
+            <w:r>
+              <w:rPr>
+                <w:sz w:val="17"/>
+              </w:rPr>
+              <w:t>Học không giám sát</w:t>
+            </w:r>
+          </w:p>
+        </w:tc>
+        <w:tc>
+          <w:tcPr>
+            <w:tcW w:type="dxa" w:w="3408"/>
+          </w:tcPr>
+          <w:p>
+            <w:pPr>
+              <w:jc w:val="center"/>
+            </w:pPr>
+            <w:r>
+              <w:rPr>
+                <w:sz w:val="17"/>
+              </w:rPr>
+              <w:t>Sai số lượng tử tối thiểu, khoảng cách tối thiểu, mAP, ước lượng hợp lý cực đại (MLE)</w:t>
+            </w:r>
+          </w:p>
+        </w:tc>
+        <w:tc>
+          <w:tcPr>
+            <w:tcW w:type="dxa" w:w="3408"/>
+          </w:tcPr>
+          <w:p>
+            <w:pPr>
+              <w:jc w:val="center"/>
+            </w:pPr>
+            <w:r>
+              <w:rPr>
+                <w:sz w:val="17"/>
+              </w:rPr>
+              <w:t>Cố gắng mô tả cấu trúc dữ liệu</w:t>
+            </w:r>
+          </w:p>
+        </w:tc>
+      </w:tr>
+    </w:tbl>
+    <w:p/>
+    <w:p>
+      <w:pPr>
+        <w:pStyle w:val="Heading2"/>
+      </w:pPr>
+      <w:r>
+        <w:t>5. Bản đồ các kỹ thuật thường gặp</w:t>
+      </w:r>
+    </w:p>
+    <w:tbl>
+      <w:tblPr>
+        <w:tblStyle w:val="LightGrid-Accent1"/>
+        <w:tblW w:type="auto" w:w="0"/>
+        <w:jc w:val="center"/>
+        <w:tblLook w:firstColumn="1" w:firstRow="1" w:lastColumn="0" w:lastRow="0" w:noHBand="0" w:noVBand="1" w:val="04A0"/>
+      </w:tblPr>
+      <w:tblGrid>
+        <w:gridCol w:w="5112"/>
+        <w:gridCol w:w="5112"/>
+      </w:tblGrid>
+      <w:tr>
+        <w:tc>
+          <w:tcPr>
+            <w:tcW w:type="dxa" w:w="5112"/>
+          </w:tcPr>
+          <w:p>
+            <w:pPr>
+              <w:jc w:val="center"/>
+            </w:pPr>
+            <w:r>
+              <w:rPr>
+                <w:b/>
+                <w:sz w:val="17"/>
+              </w:rPr>
+              <w:t>Nhóm kỹ thuật</w:t>
+            </w:r>
+          </w:p>
+        </w:tc>
+        <w:tc>
+          <w:tcPr>
+            <w:tcW w:type="dxa" w:w="5112"/>
+          </w:tcPr>
+          <w:p>
+            <w:pPr>
+              <w:jc w:val="center"/>
+            </w:pPr>
+            <w:r>
+              <w:rPr>
+                <w:b/>
+                <w:sz w:val="17"/>
+              </w:rPr>
+              <w:t>Thuật toán tiêu biểu</w:t>
+            </w:r>
+          </w:p>
+        </w:tc>
+      </w:tr>
+      <w:tr>
+        <w:tc>
+          <w:tcPr>
+            <w:tcW w:type="dxa" w:w="5112"/>
+          </w:tcPr>
+          <w:p>
+            <w:pPr>
+              <w:jc w:val="center"/>
+            </w:pPr>
+            <w:r>
+              <w:rPr>
+                <w:sz w:val="17"/>
+              </w:rPr>
+              <w:t>Phân lớp tuyến tính (linear classifier)</w:t>
+            </w:r>
+          </w:p>
+        </w:tc>
+        <w:tc>
+          <w:tcPr>
+            <w:tcW w:type="dxa" w:w="5112"/>
+          </w:tcPr>
+          <w:p>
+            <w:pPr>
+              <w:jc w:val="center"/>
+            </w:pPr>
+            <w:r>
+              <w:rPr>
+                <w:sz w:val="17"/>
+              </w:rPr>
+              <w:t>Perceptron, Logistic Regression, SVM, Adaline, MLP</w:t>
+            </w:r>
+          </w:p>
+        </w:tc>
+      </w:tr>
+      <w:tr>
+        <w:tc>
+          <w:tcPr>
+            <w:tcW w:type="dxa" w:w="5112"/>
+          </w:tcPr>
+          <w:p>
+            <w:pPr>
+              <w:jc w:val="center"/>
+            </w:pPr>
+            <w:r>
+              <w:rPr>
+                <w:sz w:val="17"/>
+              </w:rPr>
+              <w:t>Tham số / xác suất</w:t>
+            </w:r>
+          </w:p>
+        </w:tc>
+        <w:tc>
+          <w:tcPr>
+            <w:tcW w:type="dxa" w:w="5112"/>
+          </w:tcPr>
+          <w:p>
+            <w:pPr>
+              <w:jc w:val="center"/>
+            </w:pPr>
+            <w:r>
+              <w:rPr>
+                <w:sz w:val="17"/>
+              </w:rPr>
+              <w:t>Naive Bayes, GDA, HMM, mô hình đồ thị xác suất</w:t>
+            </w:r>
+          </w:p>
+        </w:tc>
+      </w:tr>
+      <w:tr>
+        <w:tc>
+          <w:tcPr>
+            <w:tcW w:type="dxa" w:w="5112"/>
+          </w:tcPr>
+          <w:p>
+            <w:pPr>
+              <w:jc w:val="center"/>
+            </w:pPr>
+            <w:r>
+              <w:rPr>
+                <w:sz w:val="17"/>
+              </w:rPr>
+              <w:t>Phi tham số (dựa trên mẫu)</w:t>
+            </w:r>
+          </w:p>
+        </w:tc>
+        <w:tc>
+          <w:tcPr>
+            <w:tcW w:type="dxa" w:w="5112"/>
+          </w:tcPr>
+          <w:p>
+            <w:pPr>
+              <w:jc w:val="center"/>
+            </w:pPr>
+            <w:r>
+              <w:rPr>
+                <w:sz w:val="17"/>
+              </w:rPr>
+              <w:t>K láng giềng gần nhất (K-NN), hồi quy hạt nhân, ước lượng mật độ hạt nhân, hồi quy cục bộ</w:t>
+            </w:r>
+          </w:p>
+        </w:tc>
+      </w:tr>
+      <w:tr>
+        <w:tc>
+          <w:tcPr>
+            <w:tcW w:type="dxa" w:w="5112"/>
+          </w:tcPr>
+          <w:p>
+            <w:pPr>
+              <w:jc w:val="center"/>
+            </w:pPr>
+            <w:r>
+              <w:rPr>
+                <w:sz w:val="17"/>
+              </w:rPr>
+              <w:t>Phi metric (ký hiệu)</w:t>
+            </w:r>
+          </w:p>
+        </w:tc>
+        <w:tc>
+          <w:tcPr>
+            <w:tcW w:type="dxa" w:w="5112"/>
+          </w:tcPr>
+          <w:p>
+            <w:pPr>
+              <w:jc w:val="center"/>
+            </w:pPr>
+            <w:r>
+              <w:rPr>
+                <w:sz w:val="17"/>
+              </w:rPr>
+              <w:t>CART, cây quyết định (Decision Tree)</w:t>
+            </w:r>
+          </w:p>
+        </w:tc>
+      </w:tr>
+      <w:tr>
+        <w:tc>
+          <w:tcPr>
+            <w:tcW w:type="dxa" w:w="5112"/>
+          </w:tcPr>
+          <w:p>
+            <w:pPr>
+              <w:jc w:val="center"/>
+            </w:pPr>
+            <w:r>
+              <w:rPr>
+                <w:sz w:val="17"/>
+              </w:rPr>
+              <w:t>Tập hợp (ensemble)</w:t>
+            </w:r>
+          </w:p>
+        </w:tc>
+        <w:tc>
+          <w:tcPr>
+            <w:tcW w:type="dxa" w:w="5112"/>
+          </w:tcPr>
+          <w:p>
+            <w:pPr>
+              <w:jc w:val="center"/>
+            </w:pPr>
+            <w:r>
+              <w:rPr>
+                <w:sz w:val="17"/>
+              </w:rPr>
+              <w:t>Bagging, AdaBoost, Random Forest</w:t>
+            </w:r>
+          </w:p>
+        </w:tc>
+      </w:tr>
+      <w:tr>
+        <w:tc>
+          <w:tcPr>
+            <w:tcW w:type="dxa" w:w="5112"/>
+          </w:tcPr>
+          <w:p>
+            <w:pPr>
+              <w:jc w:val="center"/>
+            </w:pPr>
+            <w:r>
+              <w:rPr>
+                <w:sz w:val="17"/>
+              </w:rPr>
+              <w:t>Phân cụm</w:t>
+            </w:r>
+          </w:p>
+        </w:tc>
+        <w:tc>
+          <w:tcPr>
+            <w:tcW w:type="dxa" w:w="5112"/>
+          </w:tcPr>
+          <w:p>
+            <w:pPr>
+              <w:jc w:val="center"/>
+            </w:pPr>
+            <w:r>
+              <w:rPr>
+                <w:sz w:val="17"/>
+              </w:rPr>
+              <w:t>K-means, Spectral Clustering</w:t>
+            </w:r>
+          </w:p>
+        </w:tc>
+      </w:tr>
+      <w:tr>
+        <w:tc>
+          <w:tcPr>
+            <w:tcW w:type="dxa" w:w="5112"/>
+          </w:tcPr>
+          <w:p>
+            <w:pPr>
+              <w:jc w:val="center"/>
+            </w:pPr>
+            <w:r>
+              <w:rPr>
+                <w:sz w:val="17"/>
+              </w:rPr>
+              <w:t>Ước lượng mật độ</w:t>
+            </w:r>
+          </w:p>
+        </w:tc>
+        <w:tc>
+          <w:tcPr>
+            <w:tcW w:type="dxa" w:w="5112"/>
+          </w:tcPr>
+          <w:p>
+            <w:pPr>
+              <w:jc w:val="center"/>
+            </w:pPr>
+            <w:r>
+              <w:rPr>
+                <w:sz w:val="17"/>
+              </w:rPr>
+              <w:t>GMM, Graphical Models</w:t>
+            </w:r>
+          </w:p>
+        </w:tc>
+      </w:tr>
+      <w:tr>
+        <w:tc>
+          <w:tcPr>
+            <w:tcW w:type="dxa" w:w="5112"/>
+          </w:tcPr>
+          <w:p>
+            <w:pPr>
+              <w:jc w:val="center"/>
+            </w:pPr>
+            <w:r>
+              <w:rPr>
+                <w:sz w:val="17"/>
+              </w:rPr>
+              <w:t>Giảm chiều</w:t>
+            </w:r>
+          </w:p>
+        </w:tc>
+        <w:tc>
+          <w:tcPr>
+            <w:tcW w:type="dxa" w:w="5112"/>
+          </w:tcPr>
+          <w:p>
+            <w:pPr>
+              <w:jc w:val="center"/>
+            </w:pPr>
+            <w:r>
+              <w:rPr>
+                <w:sz w:val="17"/>
+              </w:rPr>
+              <w:t>PCA, Factor Analysis</w:t>
+            </w:r>
+          </w:p>
+        </w:tc>
+      </w:tr>
+    </w:tbl>
+    <w:p/>
+    <w:p>
+      <w:pPr>
+        <w:pStyle w:val="Heading2"/>
+      </w:pPr>
+      <w:r>
+        <w:t>6. Thành tố của một hệ học máy</w:t>
+      </w:r>
+    </w:p>
+    <w:p>
+      <w:pPr/>
+      <w:r>
+        <w:rPr>
+          <w:b w:val="0"/>
+          <w:i w:val="0"/>
+        </w:rPr>
+        <w:t>Slide liệt kê 7 câu hỏi phải trả lời khi xây dựng hệ học máy:</w:t>
       </w:r>
     </w:p>
     <w:p>
@@ -108,12 +834,11 @@
         <w:pStyle w:val="ListBullet"/>
       </w:pPr>
       <w:r>
-        <w:t>The complexity in traditional computer programming is in the code (programs that people write). In machine learning,  algorithms (programs) are in principle simple and the complexity (structure) is in the data. Is there a way that we can automatically learn that structure? That is what is at the heart of machine learning.</w:t>
-      </w:r>
-    </w:p>
-    <w:p>
-      <w:r>
-        <w:t>Andrew Ng</w:t>
+        <w:rPr>
+          <w:b w:val="0"/>
+          <w:i w:val="0"/>
+        </w:rPr>
+        <w:t>Dữ liệu: ta đang có loại dữ liệu nào?</w:t>
       </w:r>
     </w:p>
     <w:p>
@@ -121,7 +846,11 @@
         <w:pStyle w:val="ListBullet"/>
       </w:pPr>
       <w:r>
-        <w:t>That is, machine learning is the about the construction and study of systems that can learn from data. This is very different than traditional computer programming.</w:t>
+        <w:rPr>
+          <w:b w:val="0"/>
+          <w:i w:val="0"/>
+        </w:rPr>
+        <w:t>Giả thiết ưu tiên: ta đã biết gì về bài toán trước khi nhìn dữ liệu?</w:t>
       </w:r>
     </w:p>
     <w:p>
@@ -129,12 +858,11 @@
         <w:pStyle w:val="ListBullet"/>
       </w:pPr>
       <w:r>
-        <w:t>Machine learning is programming computers to optimize a performance criterion using example data or past experience.</w:t>
-      </w:r>
-    </w:p>
-    <w:p>
-      <w:r>
-        <w:t>Ethem Alpaydin.</w:t>
+        <w:rPr>
+          <w:b w:val="0"/>
+          <w:i w:val="0"/>
+        </w:rPr>
+        <w:t>Biểu diễn dữ liệu: biểu diễn dữ liệu như thế nào cho thuật toán hiểu được?</w:t>
       </w:r>
     </w:p>
     <w:p>
@@ -142,7 +870,11 @@
         <w:pStyle w:val="ListBullet"/>
       </w:pPr>
       <w:r>
-        <w:t>The goal of machine learning is to develop methods that can automatically detect patterns in data, and then to use the uncovered patterns to predict future data or other outcomes of interest. Kevin P. Murphy.</w:t>
+        <w:rPr>
+          <w:b w:val="0"/>
+          <w:i w:val="0"/>
+        </w:rPr>
+        <w:t>Không gian giả thiết / mô hình: ta sẵn sàng chấp nhận những giả thiết nào để giải thích dữ liệu?</w:t>
       </w:r>
     </w:p>
     <w:p>
@@ -150,7 +882,11 @@
         <w:pStyle w:val="ListBullet"/>
       </w:pPr>
       <w:r>
-        <w:t>Learning is any process by which a system improves performance from experience. Herbert Simon.</w:t>
+        <w:rPr>
+          <w:b w:val="0"/>
+          <w:i w:val="0"/>
+        </w:rPr>
+        <w:t>Tín hiệu phản hồi: tín hiệu học là nhãn, phần thưởng trễ, hay dạng nào khác?</w:t>
       </w:r>
     </w:p>
     <w:p>
@@ -158,12 +894,11 @@
         <w:pStyle w:val="ListBullet"/>
       </w:pPr>
       <w:r>
-        <w:t>"Machine Learning: Field of study that gives computers the ability to learn without being explicitly programmed." Arthur</w:t>
-      </w:r>
-    </w:p>
-    <w:p>
-      <w:r>
-        <w:t>Samuel (1959).</w:t>
+        <w:rPr>
+          <w:b w:val="0"/>
+          <w:i w:val="0"/>
+        </w:rPr>
+        <w:t>Thuật toán học: cập nhật mô hình từ phản hồi bằng cách nào?</w:t>
       </w:r>
     </w:p>
     <w:p>
@@ -171,12 +906,49 @@
         <w:pStyle w:val="ListBullet"/>
       </w:pPr>
       <w:r>
-        <w:t>"Machine Learning at its most basic is the practice of using algorithms to parse data, learn from it, and then make a determination or prediction about something in the world." –</w:t>
+        <w:rPr>
+          <w:b w:val="0"/>
+          <w:i w:val="0"/>
+        </w:rPr>
+        <w:t>Đánh giá: làm sao biết ta đã làm tốt chưa và có nên đổi mô hình không?</w:t>
       </w:r>
     </w:p>
     <w:p>
+      <w:pPr/>
       <w:r>
-        <w:t>Nvidia.</w:t>
+        <w:rPr>
+          <w:b w:val="0"/>
+          <w:i w:val="0"/>
+        </w:rPr>
+        <w:t>Quy trình thực tế đi theo vòng lặp: hiểu lĩnh vực → tích hợp, chọn lọc, làm sạch và tiền xử lý dữ liệu → học mô hình → diễn giải kết quả → củng cố và triển khai tri thức đã khám phá, rồi lặp lại.</w:t>
+      </w:r>
+    </w:p>
+    <w:p>
+      <w:pPr/>
+      <w:r>
+        <w:rPr>
+          <w:b w:val="0"/>
+          <w:i w:val="0"/>
+        </w:rPr>
+        <w:t>Các độ đo đánh giá thường gặp được nhắc trong slide là độ chính xác (accuracy), độ chính xác và độ phủ (precision &amp; recall), bình phương lỗi, likelihood, xác suất hậu nghiệm, chi phí/lợi ích, biên (margin), entropy và phân kỳ K-L.</w:t>
+      </w:r>
+    </w:p>
+    <w:p>
+      <w:pPr>
+        <w:pStyle w:val="Heading2"/>
+      </w:pPr>
+      <w:r>
+        <w:t>7. Ứng dụng của máy học</w:t>
+      </w:r>
+    </w:p>
+    <w:p>
+      <w:pPr/>
+      <w:r>
+        <w:rPr>
+          <w:b w:val="0"/>
+          <w:i w:val="0"/>
+        </w:rPr>
+        <w:t>Slide liệt kê 52 lĩnh vực, cho thấy máy học đã len vào hầu hết mọi ngành. Một số nhóm đáng nhớ:</w:t>
       </w:r>
     </w:p>
     <w:p>
@@ -184,7 +956,11 @@
         <w:pStyle w:val="ListBullet"/>
       </w:pPr>
       <w:r>
-        <w:t>"Machine learning is the science of getting computers to act without being explicitly programmed." – Stanford.</w:t>
+        <w:rPr>
+          <w:b w:val="0"/>
+          <w:i w:val="0"/>
+        </w:rPr>
+        <w:t>Tìm kiếm và web: tìm kiếm trên web, hệ thống khuyến nghị, quảng cáo trực tuyến, retrievals thông tin, website thích ứng.</w:t>
       </w:r>
     </w:p>
     <w:p>
@@ -192,7 +968,11 @@
         <w:pStyle w:val="ListBullet"/>
       </w:pPr>
       <w:r>
-        <w:t>"Machine learning is based on algorithms that can learn from data without relying on rules-based programming." – McKinsey &amp; Co.</w:t>
+        <w:rPr>
+          <w:b w:val="0"/>
+          <w:i w:val="0"/>
+        </w:rPr>
+        <w:t>Thị giác và ngôn ngữ: thị giác máy tính, nhận dạng chữ viết tay, nhận dạng tiếng nói, xử lý và hiểu ngôn ngữ tự nhiên, dịch máy, phân tích cảm xúc.</w:t>
       </w:r>
     </w:p>
     <w:p>
@@ -200,12 +980,11 @@
         <w:pStyle w:val="ListBullet"/>
       </w:pPr>
       <w:r>
-        <w:t>"Machine learning algorithms can figure out how to perform important tasks by generalizing from examples." – University of</w:t>
-      </w:r>
-    </w:p>
-    <w:p>
-      <w:r>
-        <w:t>Washington.</w:t>
+        <w:rPr>
+          <w:b w:val="0"/>
+          <w:i w:val="0"/>
+        </w:rPr>
+        <w:t>Sinh học và y tế: sinh học tính toán, tin sinh học, phân loại chuỗi DNA, chẩn đoán y khoa, giao diện não–máy.</w:t>
       </w:r>
     </w:p>
     <w:p>
@@ -213,7 +992,33 @@
         <w:pStyle w:val="ListBullet"/>
       </w:pPr>
       <w:r>
-        <w:t>The field of Machine Learning seeks to answer the question "How can we build computer systems that automatically improve with experience, and what are the fundamental laws that govern all learning processes?" – Carnegie Mellon University.</w:t>
+        <w:rPr>
+          <w:b w:val="0"/>
+          <w:i w:val="0"/>
+        </w:rPr>
+        <w:t>Tài chính và gian lận: tài chính, ngân hàng, phát hiện gian lận thẻ tín dụng và gian lận Internet, phân tích thị trường tài chính.</w:t>
+      </w:r>
+    </w:p>
+    <w:p>
+      <w:pPr>
+        <w:pStyle w:val="ListBullet"/>
+      </w:pPr>
+      <w:r>
+        <w:rPr>
+          <w:b w:val="0"/>
+          <w:i w:val="0"/>
+        </w:rPr>
+        <w:t>Kỹ thuật và công nghiệp: robot và điều khiển robot, mạng máy tính, viễn thông, quan trắc sức khỏe công trình, tối ưu và chứng minh định lý, khai khoáng chuỗi, phân tích hành vi người dùng.</w:t>
+      </w:r>
+    </w:p>
+    <w:p>
+      <w:pPr/>
+      <w:r>
+        <w:rPr>
+          <w:b w:val="0"/>
+          <w:i w:val="0"/>
+        </w:rPr>
+        <w:t>Hình minh họa trong slide dùng bộ dữ liệu khuôn mặt của AT&amp;T Laboratories Cambridge và ví dụ điều khiển robot để cho thấy máy học nhận diện người và điều khiển hành vi như thế nào.</w:t>
       </w:r>
     </w:p>
     <w:p>
@@ -221,1465 +1026,227 @@
         <w:pStyle w:val="Heading2"/>
       </w:pPr>
       <w:r>
-        <w:t>ỨNG DỤNG MÁY HỌC</w:t>
+        <w:t>8. Dòng công việc (workflow) và câu hỏi thường gặp</w:t>
+      </w:r>
+    </w:p>
+    <w:p>
+      <w:pPr/>
+      <w:r>
+        <w:rPr>
+          <w:b w:val="0"/>
+          <w:i w:val="0"/>
+        </w:rPr>
+        <w:t>Dòng công việc chuẩn được tóm tắt trong slide Machine Learning Workflow, làm cầu nối sang các bài hồi quy tiếp theo.</w:t>
+      </w:r>
+    </w:p>
+    <w:tbl>
+      <w:tblPr>
+        <w:tblStyle w:val="LightGrid-Accent1"/>
+        <w:tblW w:type="auto" w:w="0"/>
+        <w:jc w:val="center"/>
+        <w:tblLook w:firstColumn="1" w:firstRow="1" w:lastColumn="0" w:lastRow="0" w:noHBand="0" w:noVBand="1" w:val="04A0"/>
+      </w:tblPr>
+      <w:tblGrid>
+        <w:gridCol w:w="5112"/>
+        <w:gridCol w:w="5112"/>
+      </w:tblGrid>
+      <w:tr>
+        <w:tc>
+          <w:tcPr>
+            <w:tcW w:type="dxa" w:w="5112"/>
+          </w:tcPr>
+          <w:p>
+            <w:pPr>
+              <w:jc w:val="center"/>
+            </w:pPr>
+            <w:r>
+              <w:rPr>
+                <w:b/>
+                <w:sz w:val="17"/>
+              </w:rPr>
+              <w:t>Câu hỏi</w:t>
+            </w:r>
+          </w:p>
+        </w:tc>
+        <w:tc>
+          <w:tcPr>
+            <w:tcW w:type="dxa" w:w="5112"/>
+          </w:tcPr>
+          <w:p>
+            <w:pPr>
+              <w:jc w:val="center"/>
+            </w:pPr>
+            <w:r>
+              <w:rPr>
+                <w:b/>
+                <w:sz w:val="17"/>
+              </w:rPr>
+              <w:t>Trả lời ngắn gọn từ slide</w:t>
+            </w:r>
+          </w:p>
+        </w:tc>
+      </w:tr>
+      <w:tr>
+        <w:tc>
+          <w:tcPr>
+            <w:tcW w:type="dxa" w:w="5112"/>
+          </w:tcPr>
+          <w:p>
+            <w:pPr>
+              <w:jc w:val="center"/>
+            </w:pPr>
+            <w:r>
+              <w:rPr>
+                <w:sz w:val="17"/>
+              </w:rPr>
+              <w:t>Thời gian học có lâu không?</w:t>
+            </w:r>
+          </w:p>
+        </w:tc>
+        <w:tc>
+          <w:tcPr>
+            <w:tcW w:type="dxa" w:w="5112"/>
+          </w:tcPr>
+          <w:p>
+            <w:pPr>
+              <w:jc w:val="center"/>
+            </w:pPr>
+            <w:r>
+              <w:rPr>
+                <w:sz w:val="17"/>
+              </w:rPr>
+              <w:t>Phụ thuộc vào thuật toán và kích thước bộ dữ liệu.</w:t>
+            </w:r>
+          </w:p>
+        </w:tc>
+      </w:tr>
+      <w:tr>
+        <w:tc>
+          <w:tcPr>
+            <w:tcW w:type="dxa" w:w="5112"/>
+          </w:tcPr>
+          <w:p>
+            <w:pPr>
+              <w:jc w:val="center"/>
+            </w:pPr>
+            <w:r>
+              <w:rPr>
+                <w:sz w:val="17"/>
+              </w:rPr>
+              <w:t>Dữ liệu học lấy ở đâu?</w:t>
+            </w:r>
+          </w:p>
+        </w:tc>
+        <w:tc>
+          <w:tcPr>
+            <w:tcW w:type="dxa" w:w="5112"/>
+          </w:tcPr>
+          <w:p>
+            <w:pPr>
+              <w:jc w:val="center"/>
+            </w:pPr>
+            <w:r>
+              <w:rPr>
+                <w:sz w:val="17"/>
+              </w:rPr>
+              <w:t>Tùy bài toán: do người dùng cung cấp hoặc thu thập từ thực tế.</w:t>
+            </w:r>
+          </w:p>
+        </w:tc>
+      </w:tr>
+      <w:tr>
+        <w:tc>
+          <w:tcPr>
+            <w:tcW w:type="dxa" w:w="5112"/>
+          </w:tcPr>
+          <w:p>
+            <w:pPr>
+              <w:jc w:val="center"/>
+            </w:pPr>
+            <w:r>
+              <w:rPr>
+                <w:sz w:val="17"/>
+              </w:rPr>
+              <w:t>Học xong có phải học lại không?</w:t>
+            </w:r>
+          </w:p>
+        </w:tc>
+        <w:tc>
+          <w:tcPr>
+            <w:tcW w:type="dxa" w:w="5112"/>
+          </w:tcPr>
+          <w:p>
+            <w:pPr>
+              <w:jc w:val="center"/>
+            </w:pPr>
+            <w:r>
+              <w:rPr>
+                <w:sz w:val="17"/>
+              </w:rPr>
+              <w:t>Có, cần học lại để cập nhật mô hình khi có dữ liệu mới.</w:t>
+            </w:r>
+          </w:p>
+        </w:tc>
+      </w:tr>
+      <w:tr>
+        <w:tc>
+          <w:tcPr>
+            <w:tcW w:type="dxa" w:w="5112"/>
+          </w:tcPr>
+          <w:p>
+            <w:pPr>
+              <w:jc w:val="center"/>
+            </w:pPr>
+            <w:r>
+              <w:rPr>
+                <w:sz w:val="17"/>
+              </w:rPr>
+              <w:t>Ai gán nhãn cho dữ liệu?</w:t>
+            </w:r>
+          </w:p>
+        </w:tc>
+        <w:tc>
+          <w:tcPr>
+            <w:tcW w:type="dxa" w:w="5112"/>
+          </w:tcPr>
+          <w:p>
+            <w:pPr>
+              <w:jc w:val="center"/>
+            </w:pPr>
+            <w:r>
+              <w:rPr>
+                <w:sz w:val="17"/>
+              </w:rPr>
+              <w:t>Nhóm thực hiện dự án, cụ thể là người làm dữ liệu (data annotator).</w:t>
+            </w:r>
+          </w:p>
+        </w:tc>
+      </w:tr>
+    </w:tbl>
+    <w:p/>
+    <w:p>
+      <w:pPr/>
+      <w:r>
+        <w:rPr>
+          <w:b w:val="0"/>
+          <w:i w:val="0"/>
+        </w:rPr>
+        <w:t>Thông điệp kết bài giảng: chúng ta mới chỉ có cái nhìn tổng quan; số kỹ thuật dùng máy học làm lời giải ngày càng nhiều và trong tương lai máy học sẽ đóng vai trò quan trọng trong đời sống hằng ngày.</w:t>
       </w:r>
     </w:p>
     <w:p>
       <w:r>
-        <w:t>Application</w:t>
-      </w:r>
-    </w:p>
-    <w:p>
-      <w:pPr>
-        <w:pStyle w:val="Heading1"/>
-      </w:pPr>
-      <w:r>
-        <w:t>Applications – Ứng dụng</w:t>
-      </w:r>
-    </w:p>
-    <w:p>
-      <w:r>
-        <w:t>Training examples of a person</w:t>
-      </w:r>
-    </w:p>
-    <w:p>
-      <w:r>
-        <w:t>Test images</w:t>
-      </w:r>
-    </w:p>
-    <w:p>
-      <w:r>
-        <w:t>AT&amp;T Laboratories, Cambridge UK</w:t>
-      </w:r>
-    </w:p>
-    <w:p>
-      <w:r>
-        <w:t>Robot control</w:t>
-      </w:r>
-    </w:p>
-    <w:p>
-      <w:r>
-        <w:t>1. Web search – Tìm kiếm trên web.</w:t>
-      </w:r>
-    </w:p>
-    <w:p>
-      <w:r>
-        <w:t>2. Computational biology – Sinh học tính toán.</w:t>
-      </w:r>
-    </w:p>
-    <w:p>
-      <w:r>
-        <w:t>3. Finance – Tài chính.</w:t>
-      </w:r>
-    </w:p>
-    <w:p>
-      <w:r>
-        <w:t>4. E-commerce – Thương mại điện tử.</w:t>
-      </w:r>
-    </w:p>
-    <w:p>
-      <w:r>
-        <w:t>5. Space exploration – Khám phá không gian.</w:t>
-      </w:r>
-    </w:p>
-    <w:p>
-      <w:r>
-        <w:t>6. Robotics – Rô bốt.</w:t>
-      </w:r>
-    </w:p>
-    <w:p>
-      <w:r>
-        <w:t>7. Information extraction – Rút trích thông tin.</w:t>
-      </w:r>
-    </w:p>
-    <w:p>
-      <w:r>
-        <w:t>8. Social networks – Mạng xã hội.</w:t>
-      </w:r>
-    </w:p>
-    <w:p>
-      <w:r>
-        <w:t>9. Debugging software – Kiểm thử phần mềm.</w:t>
-      </w:r>
-    </w:p>
-    <w:p>
-      <w:r>
-        <w:t>10.Agriculture – Nông nghiệp.</w:t>
-      </w:r>
-    </w:p>
-    <w:p>
-      <w:r>
-        <w:t>11.Anatomy – Giải phẩu.</w:t>
-      </w:r>
-    </w:p>
-    <w:p>
-      <w:r>
-        <w:t>12.Adaptive websites.</w:t>
-      </w:r>
-    </w:p>
-    <w:p>
-      <w:r>
-        <w:t>13.Affective computing – Tính toán hiệu quả.</w:t>
-      </w:r>
-    </w:p>
-    <w:p>
-      <w:r>
-        <w:t>14.Banking – Ngân hàng.</w:t>
-      </w:r>
-    </w:p>
-    <w:p>
-      <w:r>
-        <w:t>15.Bioinformatics – Công nghệ sinh học.</w:t>
-      </w:r>
-    </w:p>
-    <w:p>
-      <w:r>
-        <w:t>16.Brain–machine interfaces – Giao diện máy tính – não.</w:t>
-      </w:r>
-    </w:p>
-    <w:p>
-      <w:r>
-        <w:t>17.Cheminformatics – Công nghệ hóa học.</w:t>
-      </w:r>
-    </w:p>
-    <w:p>
-      <w:r>
-        <w:t>18.Computer Networks – Mạng máy tính.</w:t>
-      </w:r>
-    </w:p>
-    <w:p>
-      <w:r>
-        <w:t>19.Computer vision – Thị giác máy tính.</w:t>
-      </w:r>
-    </w:p>
-    <w:p>
-      <w:r>
-        <w:t>20.Credit-card fraud detection – Phát hiện gian lận thẻ tín dụng.</w:t>
-      </w:r>
-    </w:p>
-    <w:p>
-      <w:r>
-        <w:t>21.Data quality – Chất lượng dữ liệu.</w:t>
-      </w:r>
-    </w:p>
-    <w:p>
-      <w:r>
-        <w:t>22.DNA sequence classification – Phân loại chuỗi di truyền DNA.</w:t>
-      </w:r>
-    </w:p>
-    <w:p>
-      <w:r>
-        <w:t>23.Economics – Kinh tế.</w:t>
-      </w:r>
-    </w:p>
-    <w:p>
-      <w:r>
-        <w:t>24.Financial market analysis – Phân tích thị trường tài chính.</w:t>
-      </w:r>
-    </w:p>
-    <w:p>
-      <w:r>
-        <w:t>25.General game playing – Chơi game.</w:t>
-      </w:r>
-    </w:p>
-    <w:p>
-      <w:r>
-        <w:t>26.Handwriting recognition – Nhận dạng chữ viết tay.</w:t>
-      </w:r>
-    </w:p>
-    <w:p>
-      <w:r>
-        <w:t>27.Information retrieval – Truy xuất thông tin.</w:t>
-      </w:r>
-    </w:p>
-    <w:p>
-      <w:r>
-        <w:t>28.Insurance – Bảo hiểm.</w:t>
-      </w:r>
-    </w:p>
-    <w:p>
-      <w:r>
-        <w:t>29.Internet fraud detection – Phát hiện gian lận Internet.</w:t>
-      </w:r>
-    </w:p>
-    <w:p>
-      <w:r>
-        <w:t>30.Linguistics – Ngôn ngữ học.</w:t>
-      </w:r>
-    </w:p>
-    <w:p>
-      <w:r>
-        <w:t>31.Machine learning control – Kiểm soát máy học.</w:t>
-      </w:r>
-    </w:p>
-    <w:p>
-      <w:r>
-        <w:t>32.Machine perception – Máy perception.</w:t>
-      </w:r>
-    </w:p>
-    <w:p>
-      <w:r>
-        <w:t>33.Machine translation – Dịch máy.</w:t>
-      </w:r>
-    </w:p>
-    <w:p>
-      <w:r>
-        <w:t>34.Marketing – Tiếp thị – Quảng cáo – Điều tra thị trường.</w:t>
-      </w:r>
-    </w:p>
-    <w:p>
-      <w:r>
-        <w:t>35.Medical diagnosis – Chuẩn đoán y khoa.</w:t>
-      </w:r>
-    </w:p>
-    <w:p>
-      <w:r>
-        <w:t>36.Natural language processing – Xử lý ngôn ngữ tự nhiên.</w:t>
-      </w:r>
-    </w:p>
-    <w:p>
-      <w:r>
-        <w:t>37.Natural language understanding – Hiểu ngôn ngữ tự nhiên.</w:t>
-      </w:r>
-    </w:p>
-    <w:p>
-      <w:r>
-        <w:t>38.Online advertising – Quảng cáo online.</w:t>
-      </w:r>
-    </w:p>
-    <w:p>
-      <w:r>
-        <w:t>39.Optimization – Tối ưu.</w:t>
-      </w:r>
-    </w:p>
-    <w:p>
-      <w:r>
-        <w:t>40.Recommender systems – Hệ thống khuyến nghị (đề xuất).</w:t>
-      </w:r>
-    </w:p>
-    <w:p>
-      <w:r>
-        <w:t>41.Robot locomotion – Rô bốt đầu máy.</w:t>
-      </w:r>
-    </w:p>
-    <w:p>
-      <w:r>
-        <w:t>42.Search engines – Hệ thống tìm kiếm.</w:t>
-      </w:r>
-    </w:p>
-    <w:p>
-      <w:r>
-        <w:t>43.Sentiment analysis – Phân tích tâm lý đối tượng.</w:t>
-      </w:r>
-    </w:p>
-    <w:p>
-      <w:r>
-        <w:t>44.Sequence mining – Khai khoáng chuỗi tuần tự.</w:t>
-      </w:r>
-    </w:p>
-    <w:p>
-      <w:r>
-        <w:t>45.Software engineering – Công nghệ phần mềm.</w:t>
-      </w:r>
-    </w:p>
-    <w:p>
-      <w:r>
-        <w:t>46.Speech recognition – Nhận dạng tiếng nói.</w:t>
-      </w:r>
-    </w:p>
-    <w:p>
-      <w:r>
-        <w:t>47.Structural health monitoring – Quan trắc sức khỏe công trình.</w:t>
-      </w:r>
-    </w:p>
-    <w:p>
-      <w:r>
-        <w:t>48.Syntactic pattern recognition – Nhận dạng mẫu cú pháp.</w:t>
-      </w:r>
-    </w:p>
-    <w:p>
-      <w:r>
-        <w:t>49.Telecommunication – Thông tin liên lạc từ xa.</w:t>
-      </w:r>
-    </w:p>
-    <w:p>
-      <w:r>
-        <w:t>50.Theorem proving – Chứng minh giả thiết.</w:t>
-      </w:r>
-    </w:p>
-    <w:p>
-      <w:r>
-        <w:t>51.Time series forecasting – Dự báo chuỗi thời gian.</w:t>
-      </w:r>
-    </w:p>
-    <w:p>
-      <w:r>
-        <w:t>52.User behavior analytics – Phân tích hành vi người dùng.</w:t>
-      </w:r>
-    </w:p>
-    <w:p>
-      <w:pPr>
-        <w:pStyle w:val="Heading2"/>
-      </w:pPr>
-      <w:r>
-        <w:t>DÒNG CÔNG VIỆC TRONG MÁY HỌC</w:t>
-      </w:r>
-    </w:p>
-    <w:p>
-      <w:r>
-        <w:t>Machine Learning Workflow</w:t>
-      </w:r>
-    </w:p>
-    <w:p>
-      <w:pPr>
-        <w:pStyle w:val="Heading1"/>
-      </w:pPr>
-      <w:r>
-        <w:t>Machine Learning Workflow</w:t>
-      </w:r>
-    </w:p>
-    <w:p>
-      <w:pPr>
-        <w:pStyle w:val="Heading2"/>
-      </w:pPr>
-      <w:r>
-        <w:t>ĐỊNH NGHĨA MÁY HỌC</w:t>
-      </w:r>
-    </w:p>
-    <w:p>
-      <w:r>
-        <w:t>Definition of machine learning</w:t>
-      </w:r>
-    </w:p>
-    <w:p>
-      <w:pPr>
-        <w:pStyle w:val="Heading2"/>
-      </w:pPr>
-      <w:r>
-        <w:t>Định nghĩa máy học</w:t>
-      </w:r>
-    </w:p>
-    <w:p>
-      <w:pPr>
-        <w:pStyle w:val="ListBullet"/>
-      </w:pPr>
-      <w:r>
-        <w:t>A computer program is said to learn from experience E with respect to some tasks T and performance measure P, if its performance at tasks in T, as measured by P, improves with experience E.</w:t>
-      </w:r>
-    </w:p>
-    <w:p>
-      <w:r>
-        <w:t>Mitchell</w:t>
-      </w:r>
-    </w:p>
-    <w:p>
-      <w:pPr>
-        <w:pStyle w:val="ListBullet"/>
-      </w:pPr>
-      <w:r>
-        <w:t>Một chương trình máy tính được gọi là học từkinh nghiệm E để hoàn thành nhiệm vụT, với hiệu quả được đo bằng phép đánh giá P, nếu hiệu quả của nó khi thực hiện nhiệm vụ T, khi được đánh giá bởi P, cải thiện theo kinh nghiệm E.</w:t>
-      </w:r>
-    </w:p>
-    <w:p>
-      <w:r>
-        <w:t>Nhiệm vụT: rất nhiều nhiệm vụ phức tạp có thể giải quyết được bằng Machine Learning.</w:t>
-      </w:r>
-    </w:p>
-    <w:p>
-      <w:pPr>
-        <w:pStyle w:val="ListBullet"/>
-      </w:pPr>
-      <w:r>
-        <w:t>Classification – Phân loại – Phân lớp.</w:t>
-      </w:r>
-    </w:p>
-    <w:p>
-      <w:pPr>
-        <w:pStyle w:val="ListBullet"/>
-      </w:pPr>
-      <w:r>
-        <w:t>Regression – Hồi qui – Tiên lượng.</w:t>
-      </w:r>
-    </w:p>
-    <w:p>
-      <w:pPr>
-        <w:pStyle w:val="ListBullet"/>
-      </w:pPr>
-      <w:r>
-        <w:t>Clustering – Phân cụm – Kết nhóm.</w:t>
-      </w:r>
-    </w:p>
-    <w:p>
-      <w:r>
-        <w:t>Phép đánh giá P</w:t>
-      </w:r>
-    </w:p>
-    <w:p>
-      <w:pPr>
-        <w:pStyle w:val="ListBullet"/>
-      </w:pPr>
-      <w:r>
-        <w:t>Data point – Điểm dữ liệu.</w:t>
-      </w:r>
-    </w:p>
-    <w:p>
-      <w:pPr>
-        <w:pStyle w:val="ListBullet"/>
-      </w:pPr>
-      <w:r>
-        <w:t>Data set – Tập dữ liệu (tập hợp các điểm dữ liệu).</w:t>
-      </w:r>
-    </w:p>
-    <w:p>
-      <w:pPr>
-        <w:pStyle w:val="ListBullet"/>
-      </w:pPr>
-      <w:r>
-        <w:t>Data set.</w:t>
-      </w:r>
-    </w:p>
-    <w:p>
-      <w:pPr>
-        <w:pStyle w:val="ListBullet2"/>
-      </w:pPr>
-      <w:r>
-        <w:t>Training set – Tập dữ liệu huấn luyện – dùng để tìm tham số mô hình.</w:t>
-      </w:r>
-    </w:p>
-    <w:p>
-      <w:pPr>
-        <w:pStyle w:val="ListBullet2"/>
-      </w:pPr>
-      <w:r>
-        <w:t>Validation set – Tập dữ liệu đánh giá.</w:t>
-      </w:r>
-    </w:p>
-    <w:p>
-      <w:pPr>
-        <w:pStyle w:val="ListBullet2"/>
-      </w:pPr>
-      <w:r>
-        <w:t>Test set – Tập dữ liệu kiểm thử.</w:t>
-      </w:r>
-    </w:p>
-    <w:p>
-      <w:r>
-        <w:t>Kinh nghiệm E.</w:t>
-      </w:r>
-    </w:p>
-    <w:p>
-      <w:pPr>
-        <w:pStyle w:val="ListBullet"/>
-      </w:pPr>
-      <w:r>
-        <w:t>Việc huấn luyện các mô hình machine learning được xem là cho chúng trải nghiệm trên các tập dữ liệu (dataset) khác nhau.</w:t>
-      </w:r>
-    </w:p>
-    <w:p>
-      <w:pPr>
-        <w:pStyle w:val="ListBullet"/>
-      </w:pPr>
-      <w:r>
-        <w:t>Các tập dữ liệu khác nhau sẽ cho mô hình khác nhau.</w:t>
-      </w:r>
-    </w:p>
-    <w:p>
-      <w:pPr>
-        <w:pStyle w:val="ListBullet"/>
-      </w:pPr>
-      <w:r>
-        <w:t>Chất lượng của các tập dữ liệu ảnh hưởng đến chất lượng của mô hình.</w:t>
-      </w:r>
-    </w:p>
-    <w:p>
-      <w:pPr>
-        <w:pStyle w:val="ListBullet"/>
-      </w:pPr>
-      <w:r>
-        <w:t>Dựa trên các đặc trưng của các tập dữ liệu, các thuật toán machine learning được chia làm hai nhóm chính là:</w:t>
-      </w:r>
-    </w:p>
-    <w:p>
-      <w:pPr>
-        <w:pStyle w:val="ListBullet2"/>
-      </w:pPr>
-      <w:r>
-        <w:t>Học giám sát – supervised learning.</w:t>
-      </w:r>
-    </w:p>
-    <w:p>
-      <w:pPr>
-        <w:pStyle w:val="ListBullet2"/>
-      </w:pPr>
-      <w:r>
-        <w:t>Học không giám sát – unsupervised learning.</w:t>
-      </w:r>
-    </w:p>
-    <w:p>
-      <w:pPr>
-        <w:pStyle w:val="Heading2"/>
-      </w:pPr>
-      <w:r>
-        <w:t>PHÂN LOẠI THUẬT TOÁN MÁY HỌC</w:t>
-      </w:r>
-    </w:p>
-    <w:p>
-      <w:r>
-        <w:t>Types of Machine Learning</w:t>
-      </w:r>
-    </w:p>
-    <w:p>
-      <w:pPr>
-        <w:pStyle w:val="Heading1"/>
-      </w:pPr>
-      <w:r>
-        <w:t>Types of Machine Learning</w:t>
-      </w:r>
-    </w:p>
-    <w:p>
-      <w:pPr>
-        <w:pStyle w:val="Heading2"/>
-      </w:pPr>
-      <w:r>
-        <w:t>THUẬT TOÁN HỌC GIÁM SÁT</w:t>
-      </w:r>
-    </w:p>
-    <w:p>
-      <w:r>
-        <w:t>Supervised learning</w:t>
-      </w:r>
-    </w:p>
-    <w:p>
-      <w:pPr>
-        <w:pStyle w:val="Heading1"/>
-      </w:pPr>
-      <w:r>
-        <w:t>Supervised learning</w:t>
-      </w:r>
-    </w:p>
-    <w:p>
-      <w:pPr>
-        <w:pStyle w:val="Heading2"/>
-      </w:pPr>
-      <w:r>
-        <w:t>Thuật toán học giám sát</w:t>
-      </w:r>
-    </w:p>
-    <w:p>
-      <w:pPr>
-        <w:pStyle w:val="ListBullet"/>
-      </w:pPr>
-      <w:r>
-        <w:t>Supervised learning là thuật toán dự đoán dữ liệu đầu ra của một hoặc nhiều dữ liệu mới dựa trên các cặp dữ liệu (đầu vào, đầu ra) đã biết từ trước.</w:t>
-      </w:r>
-    </w:p>
-    <w:p>
-      <w:pPr>
-        <w:pStyle w:val="Heading2"/>
-      </w:pPr>
-      <w:r>
-        <w:t>Supervised learning</w:t>
-      </w:r>
-    </w:p>
-    <w:p>
-      <w:pPr>
-        <w:pStyle w:val="ListBullet"/>
-      </w:pPr>
-      <w:r>
-        <w:t>Phát biểu bài toán:</w:t>
-      </w:r>
-    </w:p>
-    <w:p>
-      <w:pPr>
-        <w:pStyle w:val="ListBullet2"/>
-      </w:pPr>
-      <w:r>
-        <w:t>Tập dữ liệu đầu vào:  X = x1, x2, … , xN với xi là các véc tơ.</w:t>
-      </w:r>
-    </w:p>
-    <w:p>
-      <w:pPr>
-        <w:pStyle w:val="ListBullet2"/>
-      </w:pPr>
-      <w:r>
-        <w:t>Tập dữ liệu đầu ra: Y = y1, y2, … , yM trong đó yi là các véc tơ.</w:t>
-      </w:r>
-    </w:p>
-    <w:p>
-      <w:pPr>
-        <w:pStyle w:val="ListBullet2"/>
-      </w:pPr>
-      <w:r>
-        <w:t>Các cặp dữ liệu xi, yi ∈X × Y tạo nên tập huấn luyện.</w:t>
-      </w:r>
-    </w:p>
-    <w:p>
-      <w:pPr>
-        <w:pStyle w:val="ListBullet2"/>
-      </w:pPr>
-      <w:r>
-        <w:t>Từ tập huấn luyện ta tìm hàm số f, ánh xạ mỗi phần tử từ tập X sang một phần tử (xấp xỉ) tương ứng của tập Y: y𝑖≈f xi .</w:t>
-      </w:r>
-    </w:p>
-    <w:p>
-      <w:pPr>
-        <w:pStyle w:val="ListBullet"/>
-      </w:pPr>
-      <w:r>
-        <w:t>Mục đích là xấp xỉ hàm số f thật tốt để khi có một dữ liệu x mới, chúng ta có thể tính được nhãn tương ứng ො𝑦 của nó với ො𝑦= f x .</w:t>
-      </w:r>
-    </w:p>
-    <w:p>
-      <w:pPr>
-        <w:pStyle w:val="Heading2"/>
-      </w:pPr>
-      <w:r>
-        <w:t>THUẬT TOÁN HỌC KHÔNG GIÁM SÁT</w:t>
-      </w:r>
-    </w:p>
-    <w:p>
-      <w:r>
-        <w:t>Unsupervised learning</w:t>
-      </w:r>
-    </w:p>
-    <w:p>
-      <w:pPr>
-        <w:pStyle w:val="Heading1"/>
-      </w:pPr>
-      <w:r>
-        <w:t>Unsupervised learning</w:t>
-      </w:r>
-    </w:p>
-    <w:p>
-      <w:pPr>
-        <w:pStyle w:val="Heading2"/>
-      </w:pPr>
-      <w:r>
-        <w:t>Thuật toán học không giám sát</w:t>
-      </w:r>
-    </w:p>
-    <w:p>
-      <w:pPr>
-        <w:pStyle w:val="ListBullet"/>
-      </w:pPr>
-      <w:r>
-        <w:t>Unsupervised learning là thuật toán dựa trên cấu trúc dữ liệu đầu vào để thực hiện một công việc nào đó.</w:t>
-      </w:r>
-    </w:p>
-    <w:p>
-      <w:pPr>
-        <w:pStyle w:val="ListBullet"/>
-      </w:pPr>
-      <w:r>
-        <w:t>Công việc nào đó là công việc phân nhóm (cluster), công việc giảm số chiều dữ liệu (dimensionality reduction).</w:t>
-      </w:r>
-    </w:p>
-    <w:p>
-      <w:pPr>
-        <w:pStyle w:val="ListBullet"/>
-      </w:pPr>
-      <w:r>
-        <w:t>Phát biểu bài toán:</w:t>
-      </w:r>
-    </w:p>
-    <w:p>
-      <w:pPr>
-        <w:pStyle w:val="ListBullet2"/>
-      </w:pPr>
-      <w:r>
-        <w:t>Tập dữ liệu đầu vào:  X = x1, x2, … , xN với xi là các véc tơ.</w:t>
-      </w:r>
-    </w:p>
-    <w:p>
-      <w:pPr>
-        <w:pStyle w:val="ListBullet2"/>
-      </w:pPr>
-      <w:r>
-        <w:t>Tập dữ liệu đầu ra: không có.</w:t>
-      </w:r>
-    </w:p>
-    <w:p>
-      <w:pPr>
-        <w:pStyle w:val="ListBullet2"/>
-      </w:pPr>
-      <w:r>
-        <w:t>Tập dữ liệu đầu vào X tạo nên tập huấn luyện (training set).</w:t>
-      </w:r>
-    </w:p>
-    <w:p>
-      <w:pPr>
-        <w:pStyle w:val="ListBullet2"/>
-      </w:pPr>
-      <w:r>
-        <w:t>Từ tập huấn luyện ta phát hiện mối quan hệ giữa các biến x𝑖 hoặc giữa các quan sát (observations).</w:t>
-      </w:r>
-    </w:p>
-    <w:p>
-      <w:pPr>
-        <w:pStyle w:val="ListBullet"/>
-      </w:pPr>
-      <w:r>
-        <w:t>Mục tiêu của việc học không giám sát là đểmô hình hóa cấu trúc nền tảng trong dữliệu đểhiểu rõ hơn (có tri thức hơn, có kiến thức hơn) vềchính dữ liệu đó.</w:t>
-      </w:r>
-    </w:p>
-    <w:p>
-      <w:pPr>
-        <w:pStyle w:val="Heading2"/>
-      </w:pPr>
-      <w:r>
-        <w:t>MỤC TIÊU CỦA CÁC THUẬT TOÁN HỌC</w:t>
-      </w:r>
-    </w:p>
-    <w:p>
-      <w:r>
-        <w:t>MÁY</w:t>
-      </w:r>
-    </w:p>
-    <w:p>
-      <w:r>
-        <w:t>What are seeking</w:t>
-      </w:r>
-    </w:p>
-    <w:p>
-      <w:pPr>
-        <w:pStyle w:val="Heading2"/>
-      </w:pPr>
-      <w:r>
-        <w:t>What are seeking</w:t>
-      </w:r>
-    </w:p>
-    <w:p>
-      <w:pPr>
-        <w:pStyle w:val="ListBullet"/>
-      </w:pPr>
-      <w:r>
-        <w:t>Supervised – Thuật toán học giám sát:</w:t>
-      </w:r>
-    </w:p>
-    <w:p>
-      <w:pPr>
-        <w:pStyle w:val="ListBullet2"/>
-      </w:pPr>
-      <w:r>
-        <w:t>Low Error – Lỗi thấp.</w:t>
-      </w:r>
-    </w:p>
-    <w:p>
-      <w:pPr>
-        <w:pStyle w:val="ListBullet2"/>
-      </w:pPr>
-      <w:r>
-        <w:t>Maximize probabilistic terms – Xác suất tối đa.</w:t>
-      </w:r>
-    </w:p>
-    <w:p>
-      <w:pPr>
-        <w:pStyle w:val="ListBullet"/>
-      </w:pPr>
-      <w:r>
-        <w:t>Unsupervised – Thuật toán học không giám sát:</w:t>
-      </w:r>
-    </w:p>
-    <w:p>
-      <w:pPr>
-        <w:pStyle w:val="ListBullet2"/>
-      </w:pPr>
-      <w:r>
-        <w:t>Minimum quantization error – Tối thiểu số lượng lỗi.</w:t>
-      </w:r>
-    </w:p>
-    <w:p>
-      <w:pPr>
-        <w:pStyle w:val="ListBullet2"/>
-      </w:pPr>
-      <w:r>
-        <w:t>Minimum distance – Tối thiểu khoảng cách.</w:t>
-      </w:r>
-    </w:p>
-    <w:p>
-      <w:pPr>
-        <w:pStyle w:val="ListBullet2"/>
-      </w:pPr>
-      <w:r>
-        <w:t>mAP – Độ chính xác trung bình.</w:t>
-      </w:r>
-    </w:p>
-    <w:p>
-      <w:pPr>
-        <w:pStyle w:val="ListBullet2"/>
-      </w:pPr>
-      <w:r>
-        <w:t>MLE (maximum likelihood estimation) – Ước lượng khả năng xảy ra tối đa.</w:t>
-      </w:r>
-    </w:p>
-    <w:p>
-      <w:pPr>
-        <w:pStyle w:val="Heading2"/>
-      </w:pPr>
-      <w:r>
-        <w:t>CÁC KỸ THUẬT MÁY HỌC</w:t>
-      </w:r>
-    </w:p>
-    <w:p>
-      <w:r>
-        <w:t>Learning techniques</w:t>
-      </w:r>
-    </w:p>
-    <w:p>
-      <w:pPr>
-        <w:pStyle w:val="Heading2"/>
-      </w:pPr>
-      <w:r>
-        <w:t>Các kỹ thuật máy học</w:t>
-      </w:r>
-    </w:p>
-    <w:p>
-      <w:pPr>
-        <w:pStyle w:val="ListBullet"/>
-      </w:pPr>
-      <w:r>
-        <w:t>Linear classifier – Phân lớp tuyến tính (numerical functions)</w:t>
-      </w:r>
-    </w:p>
-    <w:p>
-      <w:pPr>
-        <w:pStyle w:val="ListBullet2"/>
-      </w:pPr>
-      <w:r>
-        <w:t>Perceptron – Mạng nơ ron.</w:t>
-      </w:r>
-    </w:p>
-    <w:p>
-      <w:pPr>
-        <w:pStyle w:val="ListBullet2"/>
-      </w:pPr>
-      <w:r>
-        <w:t>Logistic regression – Hồi quy logistic.</w:t>
-      </w:r>
-    </w:p>
-    <w:p>
-      <w:pPr>
-        <w:pStyle w:val="ListBullet2"/>
-      </w:pPr>
-      <w:r>
-        <w:t>Support vector machine (SVM) – Máy học hỗ trợ.</w:t>
-      </w:r>
-    </w:p>
-    <w:p>
-      <w:pPr>
-        <w:pStyle w:val="ListBullet2"/>
-      </w:pPr>
-      <w:r>
-        <w:t>Ada-line.</w:t>
-      </w:r>
-    </w:p>
-    <w:p>
-      <w:pPr>
-        <w:pStyle w:val="ListBullet2"/>
-      </w:pPr>
-      <w:r>
-        <w:t>Multi-layer perceptron (MLP) – Mạng nơ ron đa lớp.</w:t>
-      </w:r>
-    </w:p>
-    <w:p>
-      <w:pPr>
-        <w:pStyle w:val="ListBullet"/>
-      </w:pPr>
-      <w:r>
-        <w:t>Parametric – Tham số (Probabilistic functions – Các hàm số xác suất)</w:t>
-      </w:r>
-    </w:p>
-    <w:p>
-      <w:pPr>
-        <w:pStyle w:val="ListBullet2"/>
-      </w:pPr>
-      <w:r>
-        <w:t>Naïve Bayes.</w:t>
-      </w:r>
-    </w:p>
-    <w:p>
-      <w:pPr>
-        <w:pStyle w:val="ListBullet2"/>
-      </w:pPr>
-      <w:r>
-        <w:t>Gaussian discriminant analysis (GDA).</w:t>
-      </w:r>
-    </w:p>
-    <w:p>
-      <w:pPr>
-        <w:pStyle w:val="ListBullet2"/>
-      </w:pPr>
-      <w:r>
-        <w:t>Hidden Markov models (HMM).</w:t>
-      </w:r>
-    </w:p>
-    <w:p>
-      <w:pPr>
-        <w:pStyle w:val="ListBullet2"/>
-      </w:pPr>
-      <w:r>
-        <w:t>Probabilistic graphical models.</w:t>
-      </w:r>
-    </w:p>
-    <w:p>
-      <w:pPr>
-        <w:pStyle w:val="ListBullet"/>
-      </w:pPr>
-      <w:r>
-        <w:t>Non-parametric (Instance-based functions)</w:t>
-      </w:r>
-    </w:p>
-    <w:p>
-      <w:pPr>
-        <w:pStyle w:val="ListBullet2"/>
-      </w:pPr>
-      <w:r>
-        <w:t>K-nearest neighbors.</w:t>
-      </w:r>
-    </w:p>
-    <w:p>
-      <w:pPr>
-        <w:pStyle w:val="ListBullet2"/>
-      </w:pPr>
-      <w:r>
-        <w:t>Kernel regression.</w:t>
-      </w:r>
-    </w:p>
-    <w:p>
-      <w:pPr>
-        <w:pStyle w:val="ListBullet2"/>
-      </w:pPr>
-      <w:r>
-        <w:t>Kernel density estimation.</w:t>
-      </w:r>
-    </w:p>
-    <w:p>
-      <w:pPr>
-        <w:pStyle w:val="ListBullet2"/>
-      </w:pPr>
-      <w:r>
-        <w:t>Local regression.</w:t>
-      </w:r>
-    </w:p>
-    <w:p>
-      <w:pPr>
-        <w:pStyle w:val="ListBullet"/>
-      </w:pPr>
-      <w:r>
-        <w:t>Non-metric (Symbolic functions).</w:t>
-      </w:r>
-    </w:p>
-    <w:p>
-      <w:pPr>
-        <w:pStyle w:val="ListBullet2"/>
-      </w:pPr>
-      <w:r>
-        <w:t>Classification and regression tree (CART).</w:t>
-      </w:r>
-    </w:p>
-    <w:p>
-      <w:pPr>
-        <w:pStyle w:val="ListBullet2"/>
-      </w:pPr>
-      <w:r>
-        <w:t>Decision tree – Cây quyết định.</w:t>
-      </w:r>
-    </w:p>
-    <w:p>
-      <w:pPr>
-        <w:pStyle w:val="ListBullet"/>
-      </w:pPr>
-      <w:r>
-        <w:t>Aggregation</w:t>
-      </w:r>
-    </w:p>
-    <w:p>
-      <w:pPr>
-        <w:pStyle w:val="ListBullet2"/>
-      </w:pPr>
-      <w:r>
-        <w:t>Bagging (bootstrap + aggregation).</w:t>
-      </w:r>
-    </w:p>
-    <w:p>
-      <w:pPr>
-        <w:pStyle w:val="ListBullet2"/>
-      </w:pPr>
-      <w:r>
-        <w:t>Adaboost.</w:t>
-      </w:r>
-    </w:p>
-    <w:p>
-      <w:pPr>
-        <w:pStyle w:val="ListBullet2"/>
-      </w:pPr>
-      <w:r>
-        <w:t>Random forest.</w:t>
-      </w:r>
-    </w:p>
-    <w:p>
-      <w:pPr>
-        <w:pStyle w:val="ListBullet"/>
-      </w:pPr>
-      <w:r>
-        <w:t>Clustering – Kết nhóm – Phân cụm.</w:t>
-      </w:r>
-    </w:p>
-    <w:p>
-      <w:pPr>
-        <w:pStyle w:val="ListBullet2"/>
-      </w:pPr>
-      <w:r>
-        <w:t>K-means clustering.</w:t>
-      </w:r>
-    </w:p>
-    <w:p>
-      <w:pPr>
-        <w:pStyle w:val="ListBullet2"/>
-      </w:pPr>
-      <w:r>
-        <w:t>Spectral clustering.</w:t>
-      </w:r>
-    </w:p>
-    <w:p>
-      <w:pPr>
-        <w:pStyle w:val="ListBullet"/>
-      </w:pPr>
-      <w:r>
-        <w:t>Density Estimation.</w:t>
-      </w:r>
-    </w:p>
-    <w:p>
-      <w:pPr>
-        <w:pStyle w:val="ListBullet2"/>
-      </w:pPr>
-      <w:r>
-        <w:t>Gaussian mixture model (GMM).</w:t>
-      </w:r>
-    </w:p>
-    <w:p>
-      <w:pPr>
-        <w:pStyle w:val="ListBullet2"/>
-      </w:pPr>
-      <w:r>
-        <w:t>Graphical models.</w:t>
-      </w:r>
-    </w:p>
-    <w:p>
-      <w:pPr>
-        <w:pStyle w:val="ListBullet"/>
-      </w:pPr>
-      <w:r>
-        <w:t>Dimensionality reduction – Giảm chiều dữ liệu.</w:t>
-      </w:r>
-    </w:p>
-    <w:p>
-      <w:pPr>
-        <w:pStyle w:val="ListBullet2"/>
-      </w:pPr>
-      <w:r>
-        <w:t>Principal component analysis (PCA).</w:t>
-      </w:r>
-    </w:p>
-    <w:p>
-      <w:pPr>
-        <w:pStyle w:val="ListBullet2"/>
-      </w:pPr>
-      <w:r>
-        <w:t>Factor analysis.</w:t>
-      </w:r>
-    </w:p>
-    <w:p>
-      <w:pPr>
-        <w:pStyle w:val="Heading2"/>
-      </w:pPr>
-      <w:r>
-        <w:t>HUẤN LUYỆN – KIỂM THỬ</w:t>
-      </w:r>
-    </w:p>
-    <w:p>
-      <w:r>
-        <w:t>Training and Testing</w:t>
-      </w:r>
-    </w:p>
-    <w:p>
-      <w:pPr>
-        <w:pStyle w:val="Heading1"/>
-      </w:pPr>
-      <w:r>
-        <w:t>Training and testing</w:t>
-      </w:r>
-    </w:p>
-    <w:p>
-      <w:pPr>
-        <w:pStyle w:val="Heading2"/>
-      </w:pPr>
-      <w:r>
-        <w:t>CÁC THÀNH TỐ HỌC MÁY</w:t>
-      </w:r>
-    </w:p>
-    <w:p>
-      <w:r>
-        <w:t>Ingredients</w:t>
-      </w:r>
-    </w:p>
-    <w:p>
-      <w:pPr>
-        <w:pStyle w:val="Heading2"/>
-      </w:pPr>
-      <w:r>
-        <w:t>Các thành tố học máy</w:t>
-      </w:r>
-    </w:p>
-    <w:p>
-      <w:pPr>
-        <w:pStyle w:val="ListBullet"/>
-      </w:pPr>
-      <w:r>
-        <w:t>Data – Dữ liệu:  what kind of data do we have?</w:t>
-      </w:r>
-    </w:p>
-    <w:p>
-      <w:pPr>
-        <w:pStyle w:val="ListBullet"/>
-      </w:pPr>
-      <w:r>
-        <w:t>Prior assumptions – Giả thiết ưu tiên:  what do we know a priori about the problem?</w:t>
-      </w:r>
-    </w:p>
-    <w:p>
-      <w:pPr>
-        <w:pStyle w:val="ListBullet"/>
-      </w:pPr>
-      <w:r>
-        <w:t>Representation – Biểu diễn dữ liệu: How do we represent the data?</w:t>
-      </w:r>
-    </w:p>
-    <w:p>
-      <w:pPr>
-        <w:pStyle w:val="ListBullet"/>
-      </w:pPr>
-      <w:r>
-        <w:t>Model/Hypothesis space – Mô hình/Không gian giả thiết:  What hypotheses are we willing to entertain to explain the data?</w:t>
-      </w:r>
-    </w:p>
-    <w:p>
-      <w:pPr>
-        <w:pStyle w:val="ListBullet"/>
-      </w:pPr>
-      <w:r>
-        <w:t>Feedback/learning signal: what kind of learning signal do we have (delayed, labels)?</w:t>
-      </w:r>
-    </w:p>
-    <w:p>
-      <w:pPr>
-        <w:pStyle w:val="ListBullet"/>
-      </w:pPr>
-      <w:r>
-        <w:t>Learning algorithm – Thuật toán học: How do we update the model (or set of hypothesis) from feedback?</w:t>
-      </w:r>
-    </w:p>
-    <w:p>
-      <w:pPr>
-        <w:pStyle w:val="ListBullet"/>
-      </w:pPr>
-      <w:r>
-        <w:t>Evaluation – Đánh giá: How well did we do, should we change the model?</w:t>
-      </w:r>
-    </w:p>
-    <w:p>
-      <w:pPr>
-        <w:pStyle w:val="ListBullet"/>
-      </w:pPr>
-      <w:r>
-        <w:t>Understanding domain, prior knowledge, and goals.</w:t>
-      </w:r>
-    </w:p>
-    <w:p>
-      <w:pPr>
-        <w:pStyle w:val="ListBullet"/>
-      </w:pPr>
-      <w:r>
-        <w:t>Data integration, selection, cleaning, pre-processing, etc.</w:t>
-      </w:r>
-    </w:p>
-    <w:p>
-      <w:pPr>
-        <w:pStyle w:val="ListBullet"/>
-      </w:pPr>
-      <w:r>
-        <w:t>Learning models.</w:t>
-      </w:r>
-    </w:p>
-    <w:p>
-      <w:pPr>
-        <w:pStyle w:val="ListBullet"/>
-      </w:pPr>
-      <w:r>
-        <w:t>Interpreting results.</w:t>
-      </w:r>
-    </w:p>
-    <w:p>
-      <w:pPr>
-        <w:pStyle w:val="ListBullet"/>
-      </w:pPr>
-      <w:r>
-        <w:t>Consolidating and deploying discovered knowledge.</w:t>
-      </w:r>
-    </w:p>
-    <w:p>
-      <w:pPr>
-        <w:pStyle w:val="ListBullet"/>
-      </w:pPr>
-      <w:r>
-        <w:t>Loop.</w:t>
-      </w:r>
-    </w:p>
-    <w:p>
-      <w:pPr>
-        <w:pStyle w:val="ListBullet"/>
-      </w:pPr>
-      <w:r>
-        <w:t>Accuracy – Độ chính xác.</w:t>
-      </w:r>
-    </w:p>
-    <w:p>
-      <w:pPr>
-        <w:pStyle w:val="ListBullet"/>
-      </w:pPr>
-      <w:r>
-        <w:t>Precision and recall – Độ chính xác và độ phủ.</w:t>
-      </w:r>
-    </w:p>
-    <w:p>
-      <w:pPr>
-        <w:pStyle w:val="ListBullet"/>
-      </w:pPr>
-      <w:r>
-        <w:t>Squared error – Bình phương lỗi.</w:t>
-      </w:r>
-    </w:p>
-    <w:p>
-      <w:pPr>
-        <w:pStyle w:val="ListBullet"/>
-      </w:pPr>
-      <w:r>
-        <w:t>Likelihood</w:t>
-      </w:r>
-    </w:p>
-    <w:p>
-      <w:pPr>
-        <w:pStyle w:val="ListBullet"/>
-      </w:pPr>
-      <w:r>
-        <w:t>Posterior probability</w:t>
-      </w:r>
-    </w:p>
-    <w:p>
-      <w:pPr>
-        <w:pStyle w:val="ListBullet"/>
-      </w:pPr>
-      <w:r>
-        <w:t>Cost / Utility</w:t>
-      </w:r>
-    </w:p>
-    <w:p>
-      <w:pPr>
-        <w:pStyle w:val="ListBullet"/>
-      </w:pPr>
-      <w:r>
-        <w:t>Margin</w:t>
-      </w:r>
-    </w:p>
-    <w:p>
-      <w:pPr>
-        <w:pStyle w:val="ListBullet"/>
-      </w:pPr>
-      <w:r>
-        <w:t>Entropy</w:t>
-      </w:r>
-    </w:p>
-    <w:p>
-      <w:pPr>
-        <w:pStyle w:val="ListBullet"/>
-      </w:pPr>
-      <w:r>
-        <w:t>K-L divergence,…</w:t>
-      </w:r>
-    </w:p>
-    <w:p>
-      <w:pPr>
-        <w:pStyle w:val="Heading2"/>
-      </w:pPr>
-      <w:r>
-        <w:t>KẾT BÀI GIẢNG</w:t>
-      </w:r>
-    </w:p>
-    <w:p>
-      <w:r>
-        <w:t>Conclusion</w:t>
-      </w:r>
-    </w:p>
-    <w:p>
-      <w:pPr>
-        <w:pStyle w:val="Heading2"/>
-      </w:pPr>
-      <w:r>
-        <w:t>Kết bài giảng</w:t>
-      </w:r>
-    </w:p>
-    <w:p>
-      <w:pPr>
-        <w:pStyle w:val="ListBullet"/>
-      </w:pPr>
-      <w:r>
-        <w:t>We have a simple overview of some techniques and algorithms in machine learning.</w:t>
-      </w:r>
-    </w:p>
-    <w:p>
-      <w:pPr>
-        <w:pStyle w:val="ListBullet"/>
-      </w:pPr>
-      <w:r>
-        <w:t>Chúng ta đã có cái nhìn tổng quan về máy học.</w:t>
-      </w:r>
-    </w:p>
-    <w:p>
-      <w:pPr>
-        <w:pStyle w:val="ListBullet"/>
-      </w:pPr>
-      <w:r>
-        <w:t>Furthermore, there are more and more techniques apply machine learning as a solution.</w:t>
-      </w:r>
-    </w:p>
-    <w:p>
-      <w:pPr>
-        <w:pStyle w:val="ListBullet"/>
-      </w:pPr>
-      <w:r>
-        <w:t>Hơn nữa, có nhiều kỹ thuật áp dụng cho bài toán máy học.</w:t>
-      </w:r>
-    </w:p>
-    <w:p>
-      <w:pPr>
-        <w:pStyle w:val="ListBullet"/>
-      </w:pPr>
-      <w:r>
-        <w:t>In the future, machine learning will play an important role in our daily life.</w:t>
-      </w:r>
-    </w:p>
-    <w:p>
-      <w:pPr>
-        <w:pStyle w:val="ListBullet"/>
-      </w:pPr>
-      <w:r>
-        <w:t>Trong tương lai, máy học đóng vai trò quan trọng trong cuộc sống của chúng ta.</w:t>
-      </w:r>
-    </w:p>
-    <w:p>
-      <w:pPr>
-        <w:pStyle w:val="Heading2"/>
-      </w:pPr>
-      <w:r>
-        <w:t>CÁC CÂU HỎI</w:t>
-      </w:r>
-    </w:p>
-    <w:p>
-      <w:r>
-        <w:t>Questions</w:t>
-      </w:r>
-    </w:p>
-    <w:p>
-      <w:pPr>
-        <w:pStyle w:val="Heading2"/>
-      </w:pPr>
-      <w:r>
-        <w:t>Các câu hỏi</w:t>
-      </w:r>
-    </w:p>
-    <w:p>
-      <w:pPr>
-        <w:pStyle w:val="ListBullet"/>
-      </w:pPr>
-      <w:r>
-        <w:t>Câu hỏi 01. Thời gian học lâu không?</w:t>
-      </w:r>
-    </w:p>
-    <w:p>
-      <w:pPr>
-        <w:pStyle w:val="ListBullet"/>
-      </w:pPr>
-      <w:r>
-        <w:t>Trả lời:</w:t>
-      </w:r>
-    </w:p>
-    <w:p>
-      <w:pPr>
-        <w:pStyle w:val="ListBullet2"/>
-      </w:pPr>
-      <w:r>
-        <w:t>Tùy vào thuật toán học.</w:t>
-      </w:r>
-    </w:p>
-    <w:p>
-      <w:pPr>
-        <w:pStyle w:val="ListBullet2"/>
-      </w:pPr>
-      <w:r>
-        <w:t>Tùy vào kích thước bộ dữ liệu của bài toán.</w:t>
-      </w:r>
-    </w:p>
-    <w:p>
-      <w:pPr>
-        <w:pStyle w:val="ListBullet"/>
-      </w:pPr>
-      <w:r>
-        <w:t>Câu hỏi 02. Dữ liệu để học đến từ đâu?</w:t>
-      </w:r>
-    </w:p>
-    <w:p>
-      <w:pPr>
-        <w:pStyle w:val="ListBullet"/>
-      </w:pPr>
-      <w:r>
-        <w:t>Trả lời: tùy thuộc vào bài toán, dữ liệu đến từ người dùng, hoặc thu thập.</w:t>
-      </w:r>
-    </w:p>
-    <w:p>
-      <w:pPr>
-        <w:pStyle w:val="ListBullet"/>
-      </w:pPr>
-      <w:r>
-        <w:t>Câu hỏi 03: Học rồi có học lại hay không?</w:t>
-      </w:r>
-    </w:p>
-    <w:p>
-      <w:pPr>
-        <w:pStyle w:val="ListBullet"/>
-      </w:pPr>
-      <w:r>
-        <w:t>Trả lời: Có. Học lại để cập nhật model.</w:t>
-      </w:r>
-    </w:p>
-    <w:p>
-      <w:pPr>
-        <w:pStyle w:val="ListBullet"/>
-      </w:pPr>
-      <w:r>
-        <w:t>Câu hỏi 04: Nhãn của dữ liệu do ai thực hiện.</w:t>
-      </w:r>
-    </w:p>
-    <w:p>
-      <w:pPr>
-        <w:pStyle w:val="ListBullet"/>
-      </w:pPr>
-      <w:r>
-        <w:t>Trả lời: Do nhóm người thực hiện dự án Machine learning – Cụ thể là Người làm data thực hiện.</w:t>
+        <w:rPr>
+          <w:i/>
+          <w:color w:val="777777"/>
+          <w:sz w:val="16"/>
+        </w:rPr>
+        <w:t>Ghi chú: nội dung trên bám sát 52 trang slide PDF "01 - Tổng quan 2026-09-20"; hình ảnh minh họa trong slide (sơ đồ training/query, ảnh khuôn mặt AT&amp;T) được diễn giải bằng lời thay vì chèn ảnh.</w:t>
       </w:r>
     </w:p>
     <w:sectPr>
       <w:pgSz w:w="12240" w:h="15840"/>
-      <w:pgMar w:top="1440" w:right="1800" w:bottom="1440" w:left="1800" w:header="720" w:footer="720" w:gutter="0"/>
+      <w:pgMar w:top="864" w:right="1008" w:bottom="864" w:left="1008" w:header="720" w:footer="720" w:gutter="0"/>
       <w:cols w:space="720"/>
       <w:docGrid w:linePitch="360"/>
     </w:sectPr>
@@ -2050,9 +1617,12 @@
     <w:name w:val="Normal"/>
     <w:qFormat/>
     <w:rsid w:val="00FC693F"/>
+    <w:pPr>
+      <w:spacing w:after="80" w:line="252" w:lineRule="auto"/>
+    </w:pPr>
     <w:rPr>
-      <w:rFonts w:ascii="Times New Roman" w:hAnsi="Times New Roman"/>
-      <w:sz w:val="24"/>
+      <w:rFonts w:ascii="Calibri" w:hAnsi="Calibri"/>
+      <w:sz w:val="21"/>
     </w:rPr>
   </w:style>
   <w:style w:type="paragraph" w:styleId="Header">
@@ -2110,15 +1680,15 @@
     <w:pPr>
       <w:keepNext/>
       <w:keepLines/>
-      <w:spacing w:before="480" w:after="0"/>
+      <w:spacing w:before="240" w:after="100"/>
       <w:outlineLvl w:val="0"/>
     </w:pPr>
     <w:rPr>
       <w:rFonts w:asciiTheme="majorHAnsi" w:eastAsiaTheme="majorEastAsia" w:hAnsiTheme="majorHAnsi" w:cstheme="majorBidi"/>
       <w:b/>
       <w:bCs/>
-      <w:color w:val="365F91" w:themeColor="accent1" w:themeShade="BF"/>
-      <w:sz w:val="28"/>
+      <w:color w:val="1B3A5C"/>
+      <w:sz w:val="32"/>
       <w:szCs w:val="28"/>
     </w:rPr>
   </w:style>
@@ -2134,15 +1704,15 @@
     <w:pPr>
       <w:keepNext/>
       <w:keepLines/>
-      <w:spacing w:before="200" w:after="0"/>
+      <w:spacing w:before="180" w:after="100"/>
       <w:outlineLvl w:val="1"/>
     </w:pPr>
     <w:rPr>
       <w:rFonts w:asciiTheme="majorHAnsi" w:eastAsiaTheme="majorEastAsia" w:hAnsiTheme="majorHAnsi" w:cstheme="majorBidi"/>
       <w:b/>
       <w:bCs/>
-      <w:color w:val="4F81BD" w:themeColor="accent1"/>
-      <w:sz w:val="26"/>
+      <w:color w:val="2E74B5"/>
+      <w:sz w:val="25"/>
       <w:szCs w:val="26"/>
     </w:rPr>
   </w:style>
@@ -2158,14 +1728,15 @@
     <w:pPr>
       <w:keepNext/>
       <w:keepLines/>
-      <w:spacing w:before="200" w:after="0"/>
+      <w:spacing w:before="180" w:after="100"/>
       <w:outlineLvl w:val="2"/>
     </w:pPr>
     <w:rPr>
       <w:rFonts w:asciiTheme="majorHAnsi" w:eastAsiaTheme="majorEastAsia" w:hAnsiTheme="majorHAnsi" w:cstheme="majorBidi"/>
       <w:b/>
       <w:bCs/>
-      <w:color w:val="4F81BD" w:themeColor="accent1"/>
+      <w:color w:val="444444"/>
+      <w:sz w:val="22"/>
     </w:rPr>
   </w:style>
   <w:style w:type="paragraph" w:styleId="Heading4">

</xml_diff>